<commit_message>
docs(09-governanca): patch do relatório para incluir Visão Computacional
Adiciona docs/patch-relatorio-visao-computacional.md com as substituições a
aplicar no Google Doc canônico para refletir a entrega da disciplina: linha
do Quadro 1, parágrafo da seção 2, seção 10 inteira reescrita, linha do
Quadro 3, parágrafo de contagem de módulos, linha nova no Quadro 4 e entrada
de referência do dataset Kaggle.

Inclui também a versão atualizada exportada do .docx (snapshot vindo do Doc;
o canônico segue sendo o Google Doc).
</commit_message>
<xml_diff>
--- a/09-governanca/Relatorio_GS2026_Grupo4M_NovaEconomiaEspacial.docx
+++ b/09-governanca/Relatorio_GS2026_Grupo4M_NovaEconomiaEspacial.docx
@@ -14,7 +14,7 @@
           <w:sz w:val="24"/>
           <w:szCs w:val="24"/>
         </w:rPr>
-        <w:t xml:space="preserve">FIAP — FACULDADE DE INFORMÁTICA E ADMINISTRAÇÃO PAULISTA</w:t>
+        <w:t xml:space="preserve">FIAP, FACULDADE DE INFORMÁTICA E ADMINISTRAÇÃO PAULISTA</w:t>
       </w:r>
     </w:p>
     <w:p>
@@ -40,7 +40,7 @@
           <w:sz w:val="22"/>
           <w:szCs w:val="22"/>
         </w:rPr>
-        <w:t xml:space="preserve">Bruno Lanchariche Fitipaldi Lopes — RM 564129</w:t>
+        <w:t xml:space="preserve">Bruno Lanchariche Fitipaldi Lopes, RM 564129</w:t>
       </w:r>
     </w:p>
     <w:p>
@@ -53,7 +53,7 @@
           <w:sz w:val="22"/>
           <w:szCs w:val="22"/>
         </w:rPr>
-        <w:t xml:space="preserve">Filipe Melo da Silva — RM 564571</w:t>
+        <w:t xml:space="preserve">Filipe Melo da Silva, RM 564571</w:t>
       </w:r>
     </w:p>
     <w:p>
@@ -66,7 +66,7 @@
           <w:sz w:val="22"/>
           <w:szCs w:val="22"/>
         </w:rPr>
-        <w:t xml:space="preserve">Rafael de Paiva Ramos — RM 563978</w:t>
+        <w:t xml:space="preserve">Rafael de Paiva Ramos, RM 563978</w:t>
       </w:r>
     </w:p>
     <w:p>
@@ -148,7 +148,7 @@
           <w:sz w:val="22"/>
           <w:szCs w:val="22"/>
         </w:rPr>
-        <w:t xml:space="preserve">Bruno Lanchariche Fitipaldi Lopes — RM 564129</w:t>
+        <w:t xml:space="preserve">Bruno Lanchariche Fitipaldi Lopes, RM 564129</w:t>
       </w:r>
     </w:p>
     <w:p>
@@ -161,7 +161,7 @@
           <w:sz w:val="22"/>
           <w:szCs w:val="22"/>
         </w:rPr>
-        <w:t xml:space="preserve">Filipe Melo da Silva — RM 564571</w:t>
+        <w:t xml:space="preserve">Filipe Melo da Silva, RM 564571</w:t>
       </w:r>
     </w:p>
     <w:p>
@@ -174,7 +174,7 @@
           <w:sz w:val="22"/>
           <w:szCs w:val="22"/>
         </w:rPr>
-        <w:t xml:space="preserve">Rafael de Paiva Ramos — RM 563978</w:t>
+        <w:t xml:space="preserve">Rafael de Paiva Ramos, RM 563978</w:t>
       </w:r>
     </w:p>
     <w:p>
@@ -221,7 +221,7 @@
           <w:sz w:val="20"/>
           <w:szCs w:val="20"/>
         </w:rPr>
-        <w:t xml:space="preserve">Trabalho da Global Solution 2026.1 apresentado à FIAP — Faculdade de Informática e Administração Paulista, como requisito de avaliação integrada das disciplinas do semestre, sob a disciplina de Governança em Inteligência Artificial e Business Analytics.</w:t>
+        <w:t xml:space="preserve">Trabalho da Global Solution 2026.1 apresentado à FIAP, Faculdade de Informática e Administração Paulista, como requisito de avaliação integrada das disciplinas do semestre, sob a disciplina de Governança em Inteligência Artificial e Business Analytics.</w:t>
       </w:r>
     </w:p>
     <w:p>
@@ -278,10 +278,10 @@
         <w:spacing w:after="60" w:line="360"/>
       </w:pPr>
       <w:r>
-        <w:t xml:space="preserve">Quadro 1 — Disciplinas, projetos e posição na cadeia de dados</w:t>
-      </w:r>
-      <w:r>
-        <w:t xml:space="preserve">	—</w:t>
+        <w:t xml:space="preserve">Quadro 1: Disciplinas, projetos e posição na cadeia de dados</w:t>
+      </w:r>
+      <w:r>
+        <w:t xml:space="preserve">	00</w:t>
       </w:r>
     </w:p>
     <w:p>
@@ -292,10 +292,10 @@
         <w:spacing w:after="60" w:line="360"/>
       </w:pPr>
       <w:r>
-        <w:t xml:space="preserve">Quadro 2 — Desempenho dos modelos de detecção de anomalias (QML)</w:t>
-      </w:r>
-      <w:r>
-        <w:t xml:space="preserve">	—</w:t>
+        <w:t xml:space="preserve">Quadro 2: Desempenho dos modelos de detecção de anomalias (QML)</w:t>
+      </w:r>
+      <w:r>
+        <w:t xml:space="preserve">	00</w:t>
       </w:r>
     </w:p>
     <w:p>
@@ -306,10 +306,10 @@
         <w:spacing w:after="60" w:line="360"/>
       </w:pPr>
       <w:r>
-        <w:t xml:space="preserve">Quadro 3 — Materiais integrados e não integrados</w:t>
-      </w:r>
-      <w:r>
-        <w:t xml:space="preserve">	—</w:t>
+        <w:t xml:space="preserve">Quadro 3: Materiais integrados e não integrados</w:t>
+      </w:r>
+      <w:r>
+        <w:t xml:space="preserve">	00</w:t>
       </w:r>
     </w:p>
     <w:p>
@@ -320,10 +320,10 @@
         <w:spacing w:after="60" w:line="360"/>
       </w:pPr>
       <w:r>
-        <w:t xml:space="preserve">Quadro 4 — Matriz de riscos de governança</w:t>
-      </w:r>
-      <w:r>
-        <w:t xml:space="preserve">	—</w:t>
+        <w:t xml:space="preserve">Quadro 4: Matriz de riscos de governança</w:t>
+      </w:r>
+      <w:r>
+        <w:t xml:space="preserve">	00</w:t>
       </w:r>
     </w:p>
     <w:p>
@@ -354,10 +354,10 @@
         <w:spacing w:after="60" w:line="360"/>
       </w:pPr>
       <w:r>
-        <w:t xml:space="preserve">Figura 1 — Acurácia e F1 por modelo (conjunto reduzido)</w:t>
-      </w:r>
-      <w:r>
-        <w:t xml:space="preserve">	—</w:t>
+        <w:t xml:space="preserve">Figura 1: Acurácia e F1 por modelo (conjunto reduzido)</w:t>
+      </w:r>
+      <w:r>
+        <w:t xml:space="preserve">	00</w:t>
       </w:r>
     </w:p>
     <w:p>
@@ -368,10 +368,10 @@
         <w:spacing w:after="60" w:line="360"/>
       </w:pPr>
       <w:r>
-        <w:t xml:space="preserve">Figura 2 — Acurácia frente ao tempo de treino</w:t>
-      </w:r>
-      <w:r>
-        <w:t xml:space="preserve">	—</w:t>
+        <w:t xml:space="preserve">Figura 2: Acurácia frente ao tempo de treino</w:t>
+      </w:r>
+      <w:r>
+        <w:t xml:space="preserve">	00</w:t>
       </w:r>
     </w:p>
     <w:p>
@@ -542,7 +542,7 @@
           <w:sz w:val="20"/>
           <w:szCs w:val="20"/>
         </w:rPr>
-        <w:t xml:space="preserve">Quadro 1 — Disciplinas, projetos e posição na cadeia de dados</w:t>
+        <w:t xml:space="preserve">Quadro 1: Disciplinas, projetos e posição na cadeia de dados</w:t>
       </w:r>
     </w:p>
     <w:tbl>
@@ -1551,7 +1551,7 @@
         <w:spacing w:after="160" w:before="240" w:line="360"/>
       </w:pPr>
       <w:r>
-        <w:t xml:space="preserve">3 AI FOR ROBOTIC PROCESS AUTOMATION — SPACEWATCH RPA</w:t>
+        <w:t xml:space="preserve">3 AI FOR ROBOTIC PROCESS AUTOMATION: SPACEWATCH RPA</w:t>
       </w:r>
     </w:p>
     <w:p>
@@ -1580,7 +1580,7 @@
         <w:spacing w:after="160" w:before="240" w:line="360"/>
       </w:pPr>
       <w:r>
-        <w:t xml:space="preserve">4 CLUSTER COMPUTING, COMPUTAÇÃO NEUROMÓRFICA E SUPERCOMPUTADORES — NEUROSPACE ALERT</w:t>
+        <w:t xml:space="preserve">4 CLUSTER COMPUTING, COMPUTAÇÃO NEUROMÓRFICA E SUPERCOMPUTADORES: NEUROSPACE ALERT</w:t>
       </w:r>
     </w:p>
     <w:p>
@@ -1609,7 +1609,7 @@
         <w:spacing w:after="160" w:before="240" w:line="360"/>
       </w:pPr>
       <w:r>
-        <w:t xml:space="preserve">5 COMPUTAÇÃO QUÂNTICA E IA — QML EM TELEMETRIA DE SATÉLITE</w:t>
+        <w:t xml:space="preserve">5 COMPUTAÇÃO QUÂNTICA E IA: QML EM TELEMETRIA DE SATÉLITE</w:t>
       </w:r>
     </w:p>
     <w:p>
@@ -1644,7 +1644,7 @@
           <w:sz w:val="20"/>
           <w:szCs w:val="20"/>
         </w:rPr>
-        <w:t xml:space="preserve">Quadro 2 — Desempenho dos modelos de detecção de anomalias (QML)</w:t>
+        <w:t xml:space="preserve">Quadro 2: Desempenho dos modelos de detecção de anomalias (QML)</w:t>
       </w:r>
     </w:p>
     <w:tbl>
@@ -1877,7 +1877,7 @@
                 <w:sz w:val="19"/>
                 <w:szCs w:val="19"/>
               </w:rPr>
-              <w:t xml:space="preserve">SVM (RBF) — reduzido</w:t>
+              <w:t xml:space="preserve">SVM (RBF), reduzido</w:t>
             </w:r>
           </w:p>
         </w:tc>
@@ -2037,7 +2037,7 @@
                 <w:sz w:val="19"/>
                 <w:szCs w:val="19"/>
               </w:rPr>
-              <w:t xml:space="preserve">Random Forest — reduzido</w:t>
+              <w:t xml:space="preserve">Random Forest, reduzido</w:t>
             </w:r>
           </w:p>
         </w:tc>
@@ -2517,7 +2517,7 @@
                 <w:sz w:val="19"/>
                 <w:szCs w:val="19"/>
               </w:rPr>
-              <w:t xml:space="preserve">SVM (RBF) — completo</w:t>
+              <w:t xml:space="preserve">SVM (RBF), completo</w:t>
             </w:r>
           </w:p>
         </w:tc>
@@ -2677,7 +2677,7 @@
                 <w:sz w:val="19"/>
                 <w:szCs w:val="19"/>
               </w:rPr>
-              <w:t xml:space="preserve">Random Forest — completo</w:t>
+              <w:t xml:space="preserve">Random Forest, completo</w:t>
             </w:r>
           </w:p>
         </w:tc>
@@ -2876,7 +2876,7 @@
           <w:sz w:val="18"/>
           <w:szCs w:val="18"/>
         </w:rPr>
-        <w:t xml:space="preserve">Figura 1 — Acurácia e F1 por modelo (conjunto reduzido). Fonte: os autores (2026).</w:t>
+        <w:t xml:space="preserve">Figura 1: Acurácia e F1 por modelo (conjunto reduzido). Fonte: os autores (2026).</w:t>
       </w:r>
     </w:p>
     <w:p>
@@ -2935,7 +2935,7 @@
           <w:sz w:val="18"/>
           <w:szCs w:val="18"/>
         </w:rPr>
-        <w:t xml:space="preserve">Figura 2 — Acurácia frente ao tempo de treino. Fonte: os autores (2026).</w:t>
+        <w:t xml:space="preserve">Figura 2: Acurácia frente ao tempo de treino. Fonte: os autores (2026).</w:t>
       </w:r>
     </w:p>
     <w:p>
@@ -2944,7 +2944,7 @@
         <w:spacing w:after="160" w:before="240" w:line="360"/>
       </w:pPr>
       <w:r>
-        <w:t xml:space="preserve">6 FRONT END E MOBILE DEVELOPMENT — SENTINELA ORBITAL</w:t>
+        <w:t xml:space="preserve">6 FRONT END E MOBILE DEVELOPMENT: SENTINELA ORBITAL</w:t>
       </w:r>
     </w:p>
     <w:p>
@@ -2973,7 +2973,7 @@
         <w:spacing w:after="160" w:before="240" w:line="360"/>
       </w:pPr>
       <w:r>
-        <w:t xml:space="preserve">7 GENERATIVE AI E ADVANCED NETS — SPACE CONNECT</w:t>
+        <w:t xml:space="preserve">7 GENERATIVE AI E ADVANCED NETS: SPACE CONNECT</w:t>
       </w:r>
     </w:p>
     <w:p>
@@ -3021,7 +3021,7 @@
         <w:spacing w:after="160" w:before="240" w:line="360"/>
       </w:pPr>
       <w:r>
-        <w:t xml:space="preserve">9 PROCESSAMENTO DE LINGUAGEM NATURAL, CHATBOTS E VIRTUAL AGENTS — EDIFÍCIOS VERDES E NET ZERO</w:t>
+        <w:t xml:space="preserve">9 PROCESSAMENTO DE LINGUAGEM NATURAL, CHATBOTS E VIRTUAL AGENTS: EDIFÍCIOS VERDES E NET ZERO</w:t>
       </w:r>
     </w:p>
     <w:p>
@@ -3094,7 +3094,7 @@
           <w:sz w:val="20"/>
           <w:szCs w:val="20"/>
         </w:rPr>
-        <w:t xml:space="preserve">Quadro 3 — Materiais integrados e não integrados</w:t>
+        <w:t xml:space="preserve">Quadro 3: Materiais integrados e não integrados</w:t>
       </w:r>
     </w:p>
     <w:tbl>
@@ -4168,7 +4168,7 @@
           <w:sz w:val="20"/>
           <w:szCs w:val="20"/>
         </w:rPr>
-        <w:t xml:space="preserve">Quadro 4 — Matriz de riscos de governança</w:t>
+        <w:t xml:space="preserve">Quadro 4: Matriz de riscos de governança</w:t>
       </w:r>
     </w:p>
     <w:tbl>
@@ -5014,12 +5014,6 @@
     </w:p>
     <w:p>
       <w:pPr>
-        <w:pBdr>
-          <w:top w:val="single" w:color="BF9000" w:sz="6" w:space="6"/>
-          <w:bottom w:val="single" w:color="BF9000" w:sz="6" w:space="6"/>
-          <w:left w:val="single" w:color="BF9000" w:sz="6" w:space="6"/>
-          <w:right w:val="single" w:color="BF9000" w:sz="6" w:space="6"/>
-        </w:pBdr>
         <w:shd w:fill="FFF2CC" w:val="clear"/>
         <w:spacing w:after="120" w:before="120" w:line="300"/>
       </w:pPr>
@@ -5031,7 +5025,7 @@
           <w:sz w:val="22"/>
           <w:szCs w:val="22"/>
         </w:rPr>
-        <w:t xml:space="preserve">[ESPAÇO RESERVADO PARA A CONCLUSÃO — ESCREVER À MÃO]</w:t>
+        <w:t xml:space="preserve">[ESPAÇO RESERVADO PARA A CONCLUSÃO, A SER ESCRITA PELO GRUPO]</w:t>
       </w:r>
     </w:p>
     <w:p>
@@ -5117,7 +5111,7 @@
         </w:rPr>
         <w:t xml:space="preserve">SpaceWatch RPA: </w:t>
       </w:r>
-      <w:hyperlink w:history="1" r:id="rIdhz3ynwsj1wwa3jrhj3prp">
+      <w:hyperlink w:history="1" r:id="rIdfj8zyouaz0syjntzpsujs">
         <w:r>
           <w:rPr>
             <w:rStyle w:val="Hyperlink"/>
@@ -5138,7 +5132,7 @@
         </w:rPr>
         <w:t xml:space="preserve">SENTINELA Orbital (Front): </w:t>
       </w:r>
-      <w:hyperlink w:history="1" r:id="rIdnic7keghr_hua_hkyn30f">
+      <w:hyperlink w:history="1" r:id="rIdxvevxdiumctkbywerkaol">
         <w:r>
           <w:rPr>
             <w:rStyle w:val="Hyperlink"/>
@@ -5166,7 +5160,7 @@
           <w:sz w:val="22"/>
           <w:szCs w:val="22"/>
         </w:rPr>
-        <w:t xml:space="preserve">NATIONAL AERONAUTICS AND SPACE ADMINISTRATION. NeoWs — Near Earth Object Web Service. Disponível em: https://api.nasa.gov. Acesso em: jun. 2026.</w:t>
+        <w:t xml:space="preserve">NATIONAL AERONAUTICS AND SPACE ADMINISTRATION. NeoWs: Near Earth Object Web Service. Disponível em: https://api.nasa.gov. Acesso em: jun. 2026.</w:t>
       </w:r>
     </w:p>
     <w:p>
@@ -5179,7 +5173,7 @@
           <w:sz w:val="22"/>
           <w:szCs w:val="22"/>
         </w:rPr>
-        <w:t xml:space="preserve">NATIONAL AERONAUTICS AND SPACE ADMINISTRATION. FIRMS — Fire Information for Resource Management System. Disponível em: https://firms.modaps.eosdis.nasa.gov. Acesso em: jun. 2026.</w:t>
+        <w:t xml:space="preserve">NATIONAL AERONAUTICS AND SPACE ADMINISTRATION. FIRMS: Fire Information for Resource Management System. Disponível em: https://firms.modaps.eosdis.nasa.gov. Acesso em: jun. 2026.</w:t>
       </w:r>
     </w:p>
     <w:p>

</xml_diff>